<commit_message>
docs: 技术方案测试数对齐实测（1862 passed + 4 skipped，补 #250 虚标修复）——MD/docx/pdf 三产物 7 处锚同步；docx 397,516B sha256 899ca76d…、pdf 933,575B sha256 05cfd06a…
</commit_message>
<xml_diff>
--- a/docs/AIC2026_TECH_REPORT.docx
+++ b/docs/AIC2026_TECH_REPORT.docx
@@ -41,7 +41,7 @@
         <w:rPr>
           <w:color w:val="666666"/>
         </w:rPr>
-        <w:t>测试基线:全仓 1843 passed + 4 skipped · 文档版本:通用版(赛道定制另行叠加)</w:t>
+        <w:t>测试基线:全仓 1862 passed + 4 skipped · 文档版本:通用版(赛道定制另行叠加)</w:t>
       </w:r>
     </w:p>
     <w:p>
@@ -54,7 +54,7 @@
     </w:p>
     <w:p>
       <w:r>
-        <w:t>小橘3号是运行在家庭家用设备上的私人 AI 管家系统,以"本地大模型优先、云端兜底"的双脑决策为核心,同一套权限与工具体系管控手机、家电、文件三类执行臂;通过 QQ 与网页控制台双入口服务全家,以真流式思维链提供大模型时代的关键用户体验。系统已完成 v1.0.4 版本发布,全仓 1843 项自动化测试护航,关键路径性能实测:本地热模型首 token 0.09~0.73 秒,流式推理期间并发请求零阻塞。</w:t>
+        <w:t>小橘3号是运行在家庭家用设备上的私人 AI 管家系统,以"本地大模型优先、云端兜底"的双脑决策为核心,同一套权限与工具体系管控手机、家电、文件三类执行臂;通过 QQ 与网页控制台双入口服务全家,以真流式思维链提供大模型时代的关键用户体验。系统已完成 v1.0.4 版本发布,全仓 1862 项自动化测试护航,关键路径性能实测:本地热模型首 token 0.09~0.73 秒,流式推理期间并发请求零阻塞。</w:t>
       </w:r>
     </w:p>
     <w:p>
@@ -144,7 +144,7 @@
         <w:pStyle w:val="ListNumber"/>
       </w:pPr>
       <w:r>
-        <w:t>工程可信:全链路 1843 项自动化测试护航,全程开源可查,一键构建部署。</w:t>
+        <w:t>工程可信:全链路 1862 项自动化测试护航,全程开源可查,一键构建部署。</w:t>
       </w:r>
     </w:p>
     <w:p>
@@ -1222,12 +1222,12 @@
     </w:p>
     <w:p>
       <w:r>
-        <w:t>全仓 1843 项自动化测试 + 4 项条件跳过,覆盖:双脑切换与熔断(brain)、分级门禁(tools)、SSE 协议与回退(chat_stream)、待办提取与拆库(extractor/todos_db)、权限矩阵与双因子(permission)、前端静态锚(dashboard)等核心模块。</w:t>
+        <w:t>全仓 1862 项自动化测试 + 4 项条件跳过,覆盖:双脑切换与熔断(brain)、分级门禁(tools)、SSE 协议与回退(chat_stream)、待办提取与拆库(extractor/todos_db)、权限矩阵与双因子(permission)、前端静态锚(dashboard)等核心模块。</w:t>
       </w:r>
     </w:p>
     <w:p>
       <w:r>
-        <w:t>测试纪律上有两条特色实践。其一是锚测试:关键行为以"锚"固化在测试里(如流式与同步输出逐字节一致、控制台指令清单是主指令清单的子集、前端折叠逻辑必须在 click 监听器内),锚既是回归防线也是活文档——后来者读锚即知哪些行为是被契约保护的。其二是基线纪律:任何提交只增不减(当前基线 1843 passed + 4 skipped),多轮重构(架构边界/拆库/流式)均在零回归下完成。</w:t>
+        <w:t>测试纪律上有两条特色实践。其一是锚测试:关键行为以"锚"固化在测试里(如流式与同步输出逐字节一致、控制台指令清单是主指令清单的子集、前端折叠逻辑必须在 click 监听器内),锚既是回归防线也是活文档——后来者读锚即知哪些行为是被契约保护的。其二是基线纪律:任何提交只增不减(当前基线 1862 passed + 4 skipped),多轮重构(架构边界/拆库/流式)均在零回归下完成。</w:t>
       </w:r>
     </w:p>
     <w:p>
@@ -1452,7 +1452,7 @@
               <w:rPr>
                 <w:sz w:val="19"/>
               </w:rPr>
-              <w:t>1843 项</w:t>
+              <w:t>1862 项</w:t>
             </w:r>
           </w:p>
         </w:tc>
@@ -1587,7 +1587,7 @@
     </w:p>
     <w:p>
       <w:r>
-        <w:t>*附:项目全程开源 —— https://github.com/Xun201/xiaoju3-agent(main 分支,含 1843 项测试与全部设计文档)*</w:t>
+        <w:t>*附:项目全程开源 —— https://github.com/Xun201/xiaoju3-agent(main 分支,含 1862 项测试与全部设计文档)*</w:t>
       </w:r>
     </w:p>
     <w:sectPr>

</xml_diff>